<commit_message>
Alteração do modelo para pegar mais informações
</commit_message>
<xml_diff>
--- a/static/modelo.docx
+++ b/static/modelo.docx
@@ -3,6 +3,9 @@
 <w:document xmlns:wpc="http://schemas.microsoft.com/office/word/2010/wordprocessingCanvas" xmlns:cx="http://schemas.microsoft.com/office/drawing/2014/chartex" xmlns:cx1="http://schemas.microsoft.com/office/drawing/2015/9/8/chartex" xmlns:cx2="http://schemas.microsoft.com/office/drawing/2015/10/21/chartex" xmlns:cx3="http://schemas.microsoft.com/office/drawing/2016/5/9/chartex" xmlns:cx4="http://schemas.microsoft.com/office/drawing/2016/5/10/chartex" xmlns:cx5="http://schemas.microsoft.com/office/drawing/2016/5/11/chartex" xmlns:cx6="http://schemas.microsoft.com/office/drawing/2016/5/12/chartex" xmlns:cx7="http://schemas.microsoft.com/office/drawing/2016/5/13/chartex" xmlns:cx8="http://schemas.microsoft.com/office/drawing/2016/5/14/chartex" xmlns:mc="http://schemas.openxmlformats.org/markup-compatibility/2006" xmlns:aink="http://schemas.microsoft.com/office/drawing/2016/ink" xmlns:am3d="http://schemas.microsoft.com/office/drawing/2017/model3d" xmlns:o="urn:schemas-microsoft-com:office:office" xmlns:oel="http://schemas.microsoft.com/office/2019/extlst" xmlns:r="http://schemas.openxmlformats.org/officeDocument/2006/relationships" xmlns:m="http://schemas.openxmlformats.org/officeDocument/2006/math" xmlns:v="urn:schemas-microsoft-com:vml" xmlns:wp14="http://schemas.microsoft.com/office/word/2010/wordprocessingDrawing" xmlns:wp="http://schemas.openxmlformats.org/drawingml/2006/wordprocessingDrawing" xmlns:w10="urn:schemas-microsoft-com:office:word" xmlns:w="http://schemas.openxmlformats.org/wordprocessingml/2006/main" xmlns:w14="http://schemas.microsoft.com/office/word/2010/wordml" xmlns:w15="http://schemas.microsoft.com/office/word/2012/wordml" xmlns:w16cex="http://schemas.microsoft.com/office/word/2018/wordml/cex" xmlns:w16cid="http://schemas.microsoft.com/office/word/2016/wordml/cid" xmlns:w16="http://schemas.microsoft.com/office/word/2018/wordml" xmlns:w16du="http://schemas.microsoft.com/office/word/2023/wordml/word16du" xmlns:w16sdtdh="http://schemas.microsoft.com/office/word/2020/wordml/sdtdatahash" xmlns:w16sdtfl="http://schemas.microsoft.com/office/word/2024/wordml/sdtformatlock" xmlns:w16se="http://schemas.microsoft.com/office/word/2015/wordml/symex" xmlns:wpg="http://schemas.microsoft.com/office/word/2010/wordprocessingGroup" xmlns:wpi="http://schemas.microsoft.com/office/word/2010/wordprocessingInk" xmlns:wne="http://schemas.microsoft.com/office/word/2006/wordml" xmlns:wps="http://schemas.microsoft.com/office/word/2010/wordprocessingShape" mc:Ignorable="w14 w15 w16se w16cid w16 w16cex w16sdtdh w16sdtfl w16du wp14">
   <w:body>
     <w:p>
+      <w:r>
+        <w:t xml:space="preserve">CNPJ: </w:t>
+      </w:r>
       <w:r>
         <w:t>{{</w:t>
       </w:r>
@@ -15,6 +18,153 @@
         <w:t>}}</w:t>
       </w:r>
     </w:p>
+    <w:p>
+      <w:r>
+        <w:t>Razão Social: {{</w:t>
+      </w:r>
+      <w:proofErr w:type="spellStart"/>
+      <w:r>
+        <w:t>raz</w:t>
+      </w:r>
+      <w:r>
+        <w:t>a</w:t>
+      </w:r>
+      <w:r>
+        <w:t>o_social</w:t>
+      </w:r>
+      <w:proofErr w:type="spellEnd"/>
+      <w:r>
+        <w:t>}}</w:t>
+      </w:r>
+    </w:p>
+    <w:p>
+      <w:r>
+        <w:t>Pessoas Certificadas:</w:t>
+      </w:r>
+    </w:p>
+    <w:tbl>
+      <w:tblPr>
+        <w:tblStyle w:val="Tabelacomgrade"/>
+        <w:tblW w:w="0" w:type="auto"/>
+        <w:tblLook w:val="04A0" w:firstRow="1" w:lastRow="0" w:firstColumn="1" w:lastColumn="0" w:noHBand="0" w:noVBand="1"/>
+      </w:tblPr>
+      <w:tblGrid>
+        <w:gridCol w:w="4247"/>
+        <w:gridCol w:w="4247"/>
+      </w:tblGrid>
+      <w:tr>
+        <w:tc>
+          <w:tcPr>
+            <w:tcW w:w="4247" w:type="dxa"/>
+            <w:shd w:val="clear" w:color="auto" w:fill="E8E8E8" w:themeFill="background2"/>
+          </w:tcPr>
+          <w:p>
+            <w:r>
+              <w:t>Nome</w:t>
+            </w:r>
+          </w:p>
+        </w:tc>
+        <w:tc>
+          <w:tcPr>
+            <w:tcW w:w="4247" w:type="dxa"/>
+            <w:shd w:val="clear" w:color="auto" w:fill="E8E8E8" w:themeFill="background2"/>
+          </w:tcPr>
+          <w:p>
+            <w:r>
+              <w:t>Certificado</w:t>
+            </w:r>
+          </w:p>
+        </w:tc>
+      </w:tr>
+      <w:tr>
+        <w:tc>
+          <w:tcPr>
+            <w:tcW w:w="8494" w:type="dxa"/>
+            <w:gridSpan w:val="2"/>
+          </w:tcPr>
+          <w:p>
+            <w:r>
+              <w:t>{%</w:t>
+            </w:r>
+            <w:proofErr w:type="spellStart"/>
+            <w:r>
+              <w:t>tr</w:t>
+            </w:r>
+            <w:proofErr w:type="spellEnd"/>
+            <w:r>
+              <w:t xml:space="preserve"> for item in pessoas %}</w:t>
+            </w:r>
+          </w:p>
+        </w:tc>
+      </w:tr>
+      <w:tr>
+        <w:tc>
+          <w:tcPr>
+            <w:tcW w:w="4247" w:type="dxa"/>
+          </w:tcPr>
+          <w:p>
+            <w:r>
+              <w:t>{{</w:t>
+            </w:r>
+            <w:proofErr w:type="spellStart"/>
+            <w:r>
+              <w:t>item.nome</w:t>
+            </w:r>
+            <w:proofErr w:type="spellEnd"/>
+            <w:r>
+              <w:t>}}</w:t>
+            </w:r>
+          </w:p>
+        </w:tc>
+        <w:tc>
+          <w:tcPr>
+            <w:tcW w:w="4247" w:type="dxa"/>
+          </w:tcPr>
+          <w:p>
+            <w:r>
+              <w:t>{{</w:t>
+            </w:r>
+            <w:proofErr w:type="spellStart"/>
+            <w:r>
+              <w:t>item.certificado</w:t>
+            </w:r>
+            <w:proofErr w:type="spellEnd"/>
+            <w:r>
+              <w:t>}}</w:t>
+            </w:r>
+          </w:p>
+        </w:tc>
+      </w:tr>
+      <w:tr>
+        <w:tc>
+          <w:tcPr>
+            <w:tcW w:w="8494" w:type="dxa"/>
+            <w:gridSpan w:val="2"/>
+          </w:tcPr>
+          <w:p>
+            <w:r>
+              <w:t>{%</w:t>
+            </w:r>
+            <w:proofErr w:type="spellStart"/>
+            <w:r>
+              <w:t>tr</w:t>
+            </w:r>
+            <w:proofErr w:type="spellEnd"/>
+            <w:r>
+              <w:t xml:space="preserve"> </w:t>
+            </w:r>
+            <w:proofErr w:type="spellStart"/>
+            <w:r>
+              <w:t>endfor</w:t>
+            </w:r>
+            <w:proofErr w:type="spellEnd"/>
+            <w:r>
+              <w:t xml:space="preserve"> %}</w:t>
+            </w:r>
+          </w:p>
+        </w:tc>
+      </w:tr>
+    </w:tbl>
     <w:p/>
     <w:sectPr>
       <w:pgSz w:w="11906" w:h="16838"/>
@@ -943,6 +1093,25 @@
       <w:spacing w:val="5"/>
     </w:rPr>
   </w:style>
+  <w:style w:type="table" w:styleId="Tabelacomgrade">
+    <w:name w:val="Table Grid"/>
+    <w:basedOn w:val="Tabelanormal"/>
+    <w:uiPriority w:val="39"/>
+    <w:rsid w:val="001A090B"/>
+    <w:pPr>
+      <w:spacing w:after="0" w:line="240" w:lineRule="auto"/>
+    </w:pPr>
+    <w:tblPr>
+      <w:tblBorders>
+        <w:top w:val="single" w:sz="4" w:space="0" w:color="auto"/>
+        <w:left w:val="single" w:sz="4" w:space="0" w:color="auto"/>
+        <w:bottom w:val="single" w:sz="4" w:space="0" w:color="auto"/>
+        <w:right w:val="single" w:sz="4" w:space="0" w:color="auto"/>
+        <w:insideH w:val="single" w:sz="4" w:space="0" w:color="auto"/>
+        <w:insideV w:val="single" w:sz="4" w:space="0" w:color="auto"/>
+      </w:tblBorders>
+    </w:tblPr>
+  </w:style>
 </w:styles>
 </file>
 

</xml_diff>